<commit_message>
Report 8.17, deck slide with notes, case study and README updated with kernel netem results
Co-Authored-By: Claude Sonnet 5.5 <noreply@anthropic.com>
Claude-Session: https://claude.ai/code/session_01NX2zRNpdVAnzFNKmqomzKu
</commit_message>
<xml_diff>
--- a/docs/RUDP_Case_Study.docx
+++ b/docs/RUDP_Case_Study.docx
@@ -707,6 +707,44 @@
         <w:pStyle w:val="Compact"/>
       </w:pPr>
       <w:r>
+        <w:rPr>
+          <w:bCs/>
+          <w:b/>
+        </w:rPr>
+        <w:t xml:space="preserve">On the real Linux kernel (tc/netem), against tuned AIMD:</w:t>
+      </w:r>
+      <w:r>
+        <w:t xml:space="preserve"> </w:t>
+      </w:r>
+      <w:r>
+        <w:t xml:space="preserve">the agent was 61% faster on a lossy path, 70% on a 5G-like path and 83% on a satellite path (5 runs each, all highly significant), and 33% faster with reordering (not significant).</w:t>
+      </w:r>
+      <w:r>
+        <w:t xml:space="preserve"> </w:t>
+      </w:r>
+      <w:r>
+        <w:rPr>
+          <w:bCs/>
+          <w:b/>
+        </w:rPr>
+        <w:t xml:space="preserve">Kernel TCP was faster than the agent on every path, by 1.5 to 3.2 times.</w:t>
+      </w:r>
+      <w:r>
+        <w:t xml:space="preserve"> </w:t>
+      </w:r>
+      <w:r>
+        <w:t xml:space="preserve">We do not claim to beat TCP.</w:t>
+      </w:r>
+    </w:p>
+    <w:p>
+      <w:pPr>
+        <w:numPr>
+          <w:ilvl w:val="0"/>
+          <w:numId w:val="1002"/>
+        </w:numPr>
+        <w:pStyle w:val="Compact"/>
+      </w:pPr>
+      <w:r>
         <w:t xml:space="preserve">A fuzzer fed one million random corrupted packets to the parser with none accepted. Our first checksum, a byte sum, let about 2% through, which is why we replaced it with CRC-16.</w:t>
       </w:r>
     </w:p>
@@ -777,13 +815,13 @@
           <w:bCs/>
           <w:b/>
         </w:rPr>
-        <w:t xml:space="preserve">Testing artifacts:</w:t>
-      </w:r>
-      <w:r>
-        <w:t xml:space="preserve"> </w:t>
-      </w:r>
-      <w:r>
-        <w:t xml:space="preserve">a leftover network emulation rule that made a healthy run look hung, Wireshark on Windows not seeing the WSL loopback, and buffered output that made the chat look like it lost messages.</w:t>
+        <w:t xml:space="preserve">Our first kernel runs were wrong.</w:t>
+      </w:r>
+      <w:r>
+        <w:t xml:space="preserve"> </w:t>
+      </w:r>
+      <w:r>
+        <w:t xml:space="preserve">The netem queue limit also counts packets in flight, so large windows overflowed it on the satellite path; the baseline was untuned; and TCP sent larger payloads. We fixed the setup, re-ran, and kept the failed runs in the record.</w:t>
       </w:r>
     </w:p>
     <w:p>
@@ -799,6 +837,50 @@
           <w:bCs/>
           <w:b/>
         </w:rPr>
+        <w:t xml:space="preserve">Fairness training failed.</w:t>
+      </w:r>
+      <w:r>
+        <w:t xml:space="preserve"> </w:t>
+      </w:r>
+      <w:r>
+        <w:t xml:space="preserve">Training the agent against a simulated competing flow left its share at 59% to 60%, and the simulated competitor did not reproduce real two-flow behaviour, so fairness remains a hand-made rule.</w:t>
+      </w:r>
+    </w:p>
+    <w:p>
+      <w:pPr>
+        <w:numPr>
+          <w:ilvl w:val="0"/>
+          <w:numId w:val="1003"/>
+        </w:numPr>
+        <w:pStyle w:val="Compact"/>
+      </w:pPr>
+      <w:r>
+        <w:rPr>
+          <w:bCs/>
+          <w:b/>
+        </w:rPr>
+        <w:t xml:space="preserve">Testing artifacts:</w:t>
+      </w:r>
+      <w:r>
+        <w:t xml:space="preserve"> </w:t>
+      </w:r>
+      <w:r>
+        <w:t xml:space="preserve">a leftover network emulation rule that made a healthy run look hung, Wireshark on Windows not seeing the WSL loopback, and buffered output that made the chat look like it lost messages.</w:t>
+      </w:r>
+    </w:p>
+    <w:p>
+      <w:pPr>
+        <w:numPr>
+          <w:ilvl w:val="0"/>
+          <w:numId w:val="1003"/>
+        </w:numPr>
+        <w:pStyle w:val="Compact"/>
+      </w:pPr>
+      <w:r>
+        <w:rPr>
+          <w:bCs/>
+          <w:b/>
+        </w:rPr>
         <w:t xml:space="preserve">Real sockets exposed bugs the emulator hid:</w:t>
       </w:r>
       <w:r>
@@ -894,13 +976,13 @@
           <w:bCs/>
           <w:b/>
         </w:rPr>
-        <w:t xml:space="preserve">No kernel network test.</w:t>
-      </w:r>
-      <w:r>
-        <w:t xml:space="preserve"> </w:t>
-      </w:r>
-      <w:r>
-        <w:t xml:space="preserve">Results come from a user-space proxy and a virtual-time build, not kernel netem or several machines; coexistence with kernel TCP was not tested.</w:t>
+        <w:t xml:space="preserve">Limited network testing.</w:t>
+      </w:r>
+      <w:r>
+        <w:t xml:space="preserve"> </w:t>
+      </w:r>
+      <w:r>
+        <w:t xml:space="preserve">One kernel netem run on one laptop (5 runs per cell) and a user-space proxy; no multi-machine path, and no test of sharing a link with kernel TCP. Run-to-run variation is large.</w:t>
       </w:r>
     </w:p>
     <w:p>
@@ -922,7 +1004,7 @@
         <w:t xml:space="preserve"> </w:t>
       </w:r>
       <w:r>
-        <w:t xml:space="preserve">no encryption or multiplexing, 512-byte payloads, 16 clients per server.</w:t>
+        <w:t xml:space="preserve">no encryption or multiplexing, 512-byte payloads, 16 clients per server. The sender is also available as a C library (librudp) and as a small web application, RUDP Drop, which races the policies on a chosen network.</w:t>
       </w:r>
     </w:p>
     <w:bookmarkEnd w:id="26"/>
@@ -958,7 +1040,7 @@
         <w:pStyle w:val="FirstParagraph"/>
       </w:pPr>
       <w:r>
-        <w:t xml:space="preserve">Kernel netem and multi-machine tests; a training environment with a competing flow so fairness is learned; training on recorded traces and cross traffic; a learned hand-over rule; a model-based baseline such as BBR; encryption and multiplexed streams.</w:t>
+        <w:t xml:space="preserve">Closing the gap to kernel TCP, a TCP coexistence test and multi-machine tests; a training environment with a competing flow so fairness is learned; training on recorded traces and cross traffic; a learned hand-over rule; a model-based baseline such as BBR; encryption and multiplexed streams.</w:t>
       </w:r>
     </w:p>
     <w:bookmarkEnd w:id="28"/>

</xml_diff>

<commit_message>
Docs: report 8.18-8.22, deck (37 slides), case study, literature review, host guide updated for research-gap tests
</commit_message>
<xml_diff>
--- a/docs/RUDP_Case_Study.docx
+++ b/docs/RUDP_Case_Study.docx
@@ -745,6 +745,66 @@
         <w:pStyle w:val="Compact"/>
       </w:pPr>
       <w:r>
+        <w:rPr>
+          <w:bCs/>
+          <w:b/>
+        </w:rPr>
+        <w:t xml:space="preserve">Tests for known research gaps (virtual time, 20 paired seeds):</w:t>
+      </w:r>
+      <w:r>
+        <w:t xml:space="preserve"> </w:t>
+      </w:r>
+      <w:r>
+        <w:t xml:space="preserve">when bandwidth or delay changes during a transfer the agent was fastest in all four cases (6% to 53% faster than tuned AIMD) at the price of 1% to 6% retransmissions. A simplified BBR-style baseline beat tuned AIMD on four of five paths and was</w:t>
+      </w:r>
+      <w:r>
+        <w:t xml:space="preserve"> </w:t>
+      </w:r>
+      <w:r>
+        <w:rPr>
+          <w:bCs/>
+          <w:b/>
+        </w:rPr>
+        <w:t xml:space="preserve">faster than the agent on the 2% lossy path</w:t>
+      </w:r>
+      <w:r>
+        <w:t xml:space="preserve"> </w:t>
+      </w:r>
+      <w:r>
+        <w:t xml:space="preserve">(8.2 s against 9.8 s); the agent won on the satellite-like and fast paths. Two agents sharing a link with unequal round-trip times were fairer than two AIMD flows (Jain index 0.84 against 0.64 at +150 ms), though still biased to the short-RTT flow.</w:t>
+      </w:r>
+    </w:p>
+    <w:p>
+      <w:pPr>
+        <w:numPr>
+          <w:ilvl w:val="0"/>
+          <w:numId w:val="1002"/>
+        </w:numPr>
+        <w:pStyle w:val="Compact"/>
+      </w:pPr>
+      <w:r>
+        <w:rPr>
+          <w:bCs/>
+          <w:b/>
+        </w:rPr>
+        <w:t xml:space="preserve">How far can the network be trusted?</w:t>
+      </w:r>
+      <w:r>
+        <w:t xml:space="preserve"> </w:t>
+      </w:r>
+      <w:r>
+        <w:t xml:space="preserve">A depth-5 decision tree agrees with the network on only 79% of decisions yet matches its transfer time on four of five paths; noise of 0.2 on its inputs costs at most 12%; but formal interval-bound certification succeeds for only 43% of decisions at a tiny perturbation (0.001) and none at 0.03.</w:t>
+      </w:r>
+    </w:p>
+    <w:p>
+      <w:pPr>
+        <w:numPr>
+          <w:ilvl w:val="0"/>
+          <w:numId w:val="1002"/>
+        </w:numPr>
+        <w:pStyle w:val="Compact"/>
+      </w:pPr>
+      <w:r>
         <w:t xml:space="preserve">A fuzzer fed one million random corrupted packets to the parser with none accepted. Our first checksum, a byte sum, let about 2% through, which is why we replaced it with CRC-16.</w:t>
       </w:r>
     </w:p>
@@ -982,7 +1042,7 @@
         <w:t xml:space="preserve"> </w:t>
       </w:r>
       <w:r>
-        <w:t xml:space="preserve">One kernel netem run on one laptop (5 runs per cell) and a user-space proxy; no multi-machine path, and no test of sharing a link with kernel TCP. Run-to-run variation is large.</w:t>
+        <w:t xml:space="preserve">One kernel netem run on one laptop (5 runs per cell) and a user-space proxy; no multi-machine path, and no measured test of sharing a link with kernel TCP (the script is written; it needs a Linux host with tc). The BBR-style baseline is a simplification, not the Linux BBR. Run-to-run variation is large.</w:t>
       </w:r>
     </w:p>
     <w:p>
@@ -1040,7 +1100,7 @@
         <w:pStyle w:val="FirstParagraph"/>
       </w:pPr>
       <w:r>
-        <w:t xml:space="preserve">Closing the gap to kernel TCP, a TCP coexistence test and multi-machine tests; a training environment with a competing flow so fairness is learned; training on recorded traces and cross traffic; a learned hand-over rule; a model-based baseline such as BBR; encryption and multiplexed streams.</w:t>
+        <w:t xml:space="preserve">Closing the gap to kernel TCP, a TCP coexistence test and multi-machine tests; a training environment with a competing flow so fairness is learned; training on recorded traces and cross traffic; a learned hand-over rule; a comparison against the real Linux BBR; learning with formal certificates; encryption and multiplexed streams.</w:t>
       </w:r>
     </w:p>
     <w:bookmarkEnd w:id="28"/>
@@ -2093,7 +2153,7 @@
       <w:color w:themeColor="accent1" w:themeShade="BF" w:val="365F91"/>
     </w:rPr>
   </w:style>
-  <w:style w:type="paragraph" w:customStyle="1" w:styleId="SourceCode">
+  <w:style w:customStyle="1" w:styleId="SourceCode" w:type="paragraph">
     <w:name w:val="Source Code"/>
     <w:basedOn w:val="Normal"/>
     <w:link w:val="VerbatimChar"/>
@@ -2101,7 +2161,7 @@
       <w:wordWrap w:val="off"/>
     </w:pPr>
   </w:style>
-  <w:style w:type="character" w:customStyle="1" w:styleId="KeywordTok">
+  <w:style w:customStyle="1" w:styleId="KeywordTok" w:type="character">
     <w:name w:val="KeywordTok"/>
     <w:basedOn w:val="VerbatimChar"/>
     <w:rPr>
@@ -2109,77 +2169,77 @@
       <w:b/>
     </w:rPr>
   </w:style>
-  <w:style w:type="character" w:customStyle="1" w:styleId="DataTypeTok">
+  <w:style w:customStyle="1" w:styleId="DataTypeTok" w:type="character">
     <w:name w:val="DataTypeTok"/>
     <w:basedOn w:val="VerbatimChar"/>
     <w:rPr>
       <w:color w:val="902000"/>
     </w:rPr>
   </w:style>
-  <w:style w:type="character" w:customStyle="1" w:styleId="DecValTok">
+  <w:style w:customStyle="1" w:styleId="DecValTok" w:type="character">
     <w:name w:val="DecValTok"/>
     <w:basedOn w:val="VerbatimChar"/>
     <w:rPr>
       <w:color w:val="40a070"/>
     </w:rPr>
   </w:style>
-  <w:style w:type="character" w:customStyle="1" w:styleId="BaseNTok">
+  <w:style w:customStyle="1" w:styleId="BaseNTok" w:type="character">
     <w:name w:val="BaseNTok"/>
     <w:basedOn w:val="VerbatimChar"/>
     <w:rPr>
       <w:color w:val="40a070"/>
     </w:rPr>
   </w:style>
-  <w:style w:type="character" w:customStyle="1" w:styleId="FloatTok">
+  <w:style w:customStyle="1" w:styleId="FloatTok" w:type="character">
     <w:name w:val="FloatTok"/>
     <w:basedOn w:val="VerbatimChar"/>
     <w:rPr>
       <w:color w:val="40a070"/>
     </w:rPr>
   </w:style>
-  <w:style w:type="character" w:customStyle="1" w:styleId="ConstantTok">
+  <w:style w:customStyle="1" w:styleId="ConstantTok" w:type="character">
     <w:name w:val="ConstantTok"/>
     <w:basedOn w:val="VerbatimChar"/>
     <w:rPr>
       <w:color w:val="880000"/>
     </w:rPr>
   </w:style>
-  <w:style w:type="character" w:customStyle="1" w:styleId="CharTok">
+  <w:style w:customStyle="1" w:styleId="CharTok" w:type="character">
     <w:name w:val="CharTok"/>
     <w:basedOn w:val="VerbatimChar"/>
     <w:rPr>
       <w:color w:val="4070a0"/>
     </w:rPr>
   </w:style>
-  <w:style w:type="character" w:customStyle="1" w:styleId="SpecialCharTok">
+  <w:style w:customStyle="1" w:styleId="SpecialCharTok" w:type="character">
     <w:name w:val="SpecialCharTok"/>
     <w:basedOn w:val="VerbatimChar"/>
     <w:rPr>
       <w:color w:val="4070a0"/>
     </w:rPr>
   </w:style>
-  <w:style w:type="character" w:customStyle="1" w:styleId="StringTok">
+  <w:style w:customStyle="1" w:styleId="StringTok" w:type="character">
     <w:name w:val="StringTok"/>
     <w:basedOn w:val="VerbatimChar"/>
     <w:rPr>
       <w:color w:val="4070a0"/>
     </w:rPr>
   </w:style>
-  <w:style w:type="character" w:customStyle="1" w:styleId="VerbatimStringTok">
+  <w:style w:customStyle="1" w:styleId="VerbatimStringTok" w:type="character">
     <w:name w:val="VerbatimStringTok"/>
     <w:basedOn w:val="VerbatimChar"/>
     <w:rPr>
       <w:color w:val="4070a0"/>
     </w:rPr>
   </w:style>
-  <w:style w:type="character" w:customStyle="1" w:styleId="SpecialStringTok">
+  <w:style w:customStyle="1" w:styleId="SpecialStringTok" w:type="character">
     <w:name w:val="SpecialStringTok"/>
     <w:basedOn w:val="VerbatimChar"/>
     <w:rPr>
       <w:color w:val="bb6688"/>
     </w:rPr>
   </w:style>
-  <w:style w:type="character" w:customStyle="1" w:styleId="ImportTok">
+  <w:style w:customStyle="1" w:styleId="ImportTok" w:type="character">
     <w:name w:val="ImportTok"/>
     <w:basedOn w:val="VerbatimChar"/>
     <w:rPr>
@@ -2187,7 +2247,7 @@
       <w:b/>
     </w:rPr>
   </w:style>
-  <w:style w:type="character" w:customStyle="1" w:styleId="CommentTok">
+  <w:style w:customStyle="1" w:styleId="CommentTok" w:type="character">
     <w:name w:val="CommentTok"/>
     <w:basedOn w:val="VerbatimChar"/>
     <w:rPr>
@@ -2195,7 +2255,7 @@
       <w:i/>
     </w:rPr>
   </w:style>
-  <w:style w:type="character" w:customStyle="1" w:styleId="DocumentationTok">
+  <w:style w:customStyle="1" w:styleId="DocumentationTok" w:type="character">
     <w:name w:val="DocumentationTok"/>
     <w:basedOn w:val="VerbatimChar"/>
     <w:rPr>
@@ -2203,7 +2263,7 @@
       <w:i/>
     </w:rPr>
   </w:style>
-  <w:style w:type="character" w:customStyle="1" w:styleId="AnnotationTok">
+  <w:style w:customStyle="1" w:styleId="AnnotationTok" w:type="character">
     <w:name w:val="AnnotationTok"/>
     <w:basedOn w:val="VerbatimChar"/>
     <w:rPr>
@@ -2212,7 +2272,7 @@
       <w:i/>
     </w:rPr>
   </w:style>
-  <w:style w:type="character" w:customStyle="1" w:styleId="CommentVarTok">
+  <w:style w:customStyle="1" w:styleId="CommentVarTok" w:type="character">
     <w:name w:val="CommentVarTok"/>
     <w:basedOn w:val="VerbatimChar"/>
     <w:rPr>
@@ -2221,28 +2281,28 @@
       <w:i/>
     </w:rPr>
   </w:style>
-  <w:style w:type="character" w:customStyle="1" w:styleId="OtherTok">
+  <w:style w:customStyle="1" w:styleId="OtherTok" w:type="character">
     <w:name w:val="OtherTok"/>
     <w:basedOn w:val="VerbatimChar"/>
     <w:rPr>
       <w:color w:val="007020"/>
     </w:rPr>
   </w:style>
-  <w:style w:type="character" w:customStyle="1" w:styleId="FunctionTok">
+  <w:style w:customStyle="1" w:styleId="FunctionTok" w:type="character">
     <w:name w:val="FunctionTok"/>
     <w:basedOn w:val="VerbatimChar"/>
     <w:rPr>
       <w:color w:val="06287e"/>
     </w:rPr>
   </w:style>
-  <w:style w:type="character" w:customStyle="1" w:styleId="VariableTok">
+  <w:style w:customStyle="1" w:styleId="VariableTok" w:type="character">
     <w:name w:val="VariableTok"/>
     <w:basedOn w:val="VerbatimChar"/>
     <w:rPr>
       <w:color w:val="19177c"/>
     </w:rPr>
   </w:style>
-  <w:style w:type="character" w:customStyle="1" w:styleId="ControlFlowTok">
+  <w:style w:customStyle="1" w:styleId="ControlFlowTok" w:type="character">
     <w:name w:val="ControlFlowTok"/>
     <w:basedOn w:val="VerbatimChar"/>
     <w:rPr>
@@ -2250,45 +2310,45 @@
       <w:b/>
     </w:rPr>
   </w:style>
-  <w:style w:type="character" w:customStyle="1" w:styleId="OperatorTok">
+  <w:style w:customStyle="1" w:styleId="OperatorTok" w:type="character">
     <w:name w:val="OperatorTok"/>
     <w:basedOn w:val="VerbatimChar"/>
     <w:rPr>
       <w:color w:val="666666"/>
     </w:rPr>
   </w:style>
-  <w:style w:type="character" w:customStyle="1" w:styleId="BuiltInTok">
+  <w:style w:customStyle="1" w:styleId="BuiltInTok" w:type="character">
     <w:name w:val="BuiltInTok"/>
     <w:basedOn w:val="VerbatimChar"/>
     <w:rPr>
       <w:color w:val="008000"/>
     </w:rPr>
   </w:style>
-  <w:style w:type="character" w:customStyle="1" w:styleId="ExtensionTok">
+  <w:style w:customStyle="1" w:styleId="ExtensionTok" w:type="character">
     <w:name w:val="ExtensionTok"/>
     <w:basedOn w:val="VerbatimChar"/>
     <w:rPr/>
   </w:style>
-  <w:style w:type="character" w:customStyle="1" w:styleId="PreprocessorTok">
+  <w:style w:customStyle="1" w:styleId="PreprocessorTok" w:type="character">
     <w:name w:val="PreprocessorTok"/>
     <w:basedOn w:val="VerbatimChar"/>
     <w:rPr>
       <w:color w:val="bc7a00"/>
     </w:rPr>
   </w:style>
-  <w:style w:type="character" w:customStyle="1" w:styleId="AttributeTok">
+  <w:style w:customStyle="1" w:styleId="AttributeTok" w:type="character">
     <w:name w:val="AttributeTok"/>
     <w:basedOn w:val="VerbatimChar"/>
     <w:rPr>
       <w:color w:val="7d9029"/>
     </w:rPr>
   </w:style>
-  <w:style w:type="character" w:customStyle="1" w:styleId="RegionMarkerTok">
+  <w:style w:customStyle="1" w:styleId="RegionMarkerTok" w:type="character">
     <w:name w:val="RegionMarkerTok"/>
     <w:basedOn w:val="VerbatimChar"/>
     <w:rPr/>
   </w:style>
-  <w:style w:type="character" w:customStyle="1" w:styleId="InformationTok">
+  <w:style w:customStyle="1" w:styleId="InformationTok" w:type="character">
     <w:name w:val="InformationTok"/>
     <w:basedOn w:val="VerbatimChar"/>
     <w:rPr>
@@ -2297,7 +2357,7 @@
       <w:i/>
     </w:rPr>
   </w:style>
-  <w:style w:type="character" w:customStyle="1" w:styleId="WarningTok">
+  <w:style w:customStyle="1" w:styleId="WarningTok" w:type="character">
     <w:name w:val="WarningTok"/>
     <w:basedOn w:val="VerbatimChar"/>
     <w:rPr>
@@ -2306,7 +2366,7 @@
       <w:i/>
     </w:rPr>
   </w:style>
-  <w:style w:type="character" w:customStyle="1" w:styleId="AlertTok">
+  <w:style w:customStyle="1" w:styleId="AlertTok" w:type="character">
     <w:name w:val="AlertTok"/>
     <w:basedOn w:val="VerbatimChar"/>
     <w:rPr>
@@ -2314,7 +2374,7 @@
       <w:b/>
     </w:rPr>
   </w:style>
-  <w:style w:type="character" w:customStyle="1" w:styleId="ErrorTok">
+  <w:style w:customStyle="1" w:styleId="ErrorTok" w:type="character">
     <w:name w:val="ErrorTok"/>
     <w:basedOn w:val="VerbatimChar"/>
     <w:rPr>
@@ -2322,7 +2382,7 @@
       <w:b/>
     </w:rPr>
   </w:style>
-  <w:style w:type="character" w:customStyle="1" w:styleId="NormalTok">
+  <w:style w:customStyle="1" w:styleId="NormalTok" w:type="character">
     <w:name w:val="NormalTok"/>
     <w:basedOn w:val="VerbatimChar"/>
     <w:rPr/>

</xml_diff>

<commit_message>
Docs updated with corrected kernel results and coexistence
</commit_message>
<xml_diff>
--- a/docs/RUDP_Case_Study.docx
+++ b/docs/RUDP_Case_Study.docx
@@ -717,7 +717,7 @@
         <w:t xml:space="preserve"> </w:t>
       </w:r>
       <w:r>
-        <w:t xml:space="preserve">the agent was 61% faster on a lossy path, 70% on a 5G-like path and 83% on a satellite path (5 runs each, all highly significant), and 33% faster with reordering (not significant).</w:t>
+        <w:t xml:space="preserve">the agent was 71% faster on a lossy path, 65% on a 5G-like path and 83% on a satellite path (3 to 5 runs each, all significant), and 60% faster with reordering (not significant).</w:t>
       </w:r>
       <w:r>
         <w:t xml:space="preserve"> </w:t>
@@ -727,13 +727,26 @@
           <w:bCs/>
           <w:b/>
         </w:rPr>
-        <w:t xml:space="preserve">Kernel TCP was faster than the agent on every path, by 1.5 to 3.2 times.</w:t>
+        <w:t xml:space="preserve">Kernel TCP was faster than the agent on every path, by 1.5 to 1.7 times.</w:t>
       </w:r>
       <w:r>
         <w:t xml:space="preserve"> </w:t>
       </w:r>
       <w:r>
         <w:t xml:space="preserve">We do not claim to beat TCP.</w:t>
+      </w:r>
+      <w:r>
+        <w:t xml:space="preserve"> </w:t>
+      </w:r>
+      <w:r>
+        <w:rPr>
+          <w:bCs/>
+          <w:b/>
+        </w:rPr>
+        <w:t xml:space="preserve">Sharing a link with kernel TCP</w:t>
+      </w:r>
+      <w:r>
+        <w:t xml:space="preserve">, the agent took only 24% to 34% of the bandwidth (tuned AIMD 5% to 17%), so it does not starve TCP (3 runs per cell, one laptop).</w:t>
       </w:r>
     </w:p>
     <w:p>
@@ -875,13 +888,13 @@
           <w:bCs/>
           <w:b/>
         </w:rPr>
-        <w:t xml:space="preserve">Our first kernel runs were wrong.</w:t>
-      </w:r>
-      <w:r>
-        <w:t xml:space="preserve"> </w:t>
-      </w:r>
-      <w:r>
-        <w:t xml:space="preserve">The netem queue limit also counts packets in flight, so large windows overflowed it on the satellite path; the baseline was untuned; and TCP sent larger payloads. We fixed the setup, re-ran, and kept the failed runs in the record.</w:t>
+        <w:t xml:space="preserve">Our first kernel runs were wrong, four times.</w:t>
+      </w:r>
+      <w:r>
+        <w:t xml:space="preserve"> </w:t>
+      </w:r>
+      <w:r>
+        <w:t xml:space="preserve">The netem queue limit also counts packets in flight, so large windows overflowed it on the satellite path; the baseline was untuned; TCP sent larger payloads; and finally RUDP was sending 40-byte synthetic packets, found only because a goodput came out above the link capacity. We fixed each, re-ran everything and kept the failed runs in the record.</w:t>
       </w:r>
     </w:p>
     <w:p>
@@ -1042,7 +1055,7 @@
         <w:t xml:space="preserve"> </w:t>
       </w:r>
       <w:r>
-        <w:t xml:space="preserve">One kernel netem run on one laptop (5 runs per cell) and a user-space proxy; no multi-machine path, and no measured test of sharing a link with kernel TCP (the script is written; it needs a Linux host with tc). The BBR-style baseline is a simplification, not the Linux BBR. Run-to-run variation is large.</w:t>
+        <w:t xml:space="preserve">One kernel netem run on one laptop (5 runs per cell) and a user-space proxy; no multi-machine path, and the test of sharing a link with kernel TCP has only 3 runs per cell. The BBR-style baseline is a simplification, not the Linux BBR. Run-to-run variation is large.</w:t>
       </w:r>
     </w:p>
     <w:p>

</xml_diff>